<commit_message>
update vendor B compiler spec
</commit_message>
<xml_diff>
--- a/output/xx.docx
+++ b/output/xx.docx
@@ -994,6 +994,653 @@
             </w:pPr>
             <w:r>
               <w:t xml:space="preserve">D0690 SHD6T</w:t>
+            </w:r>
+          </w:p>
+        </w:tc>
+      </w:tr>
+    </w:tbl>
+    <w:p/>
+    <w:p>
+      <w:pPr>
+        <w:pStyle w:val="TableCaption"/>
+      </w:pPr>
+      <w:r>
+        <w:t xml:space="preserve">Vendor B Memory Compiler </w:t>
+      </w:r>
+      <w:r>
+        <w:rPr>
+          <w:rFonts w:hint="eastAsia"/>
+        </w:rPr>
+        <w:t xml:space="preserve">定义</w:t>
+      </w:r>
+    </w:p>
+    <w:tbl>
+      <w:tblPr>
+        <w:tblStyle w:val="Table"/>
+        <w:tblW w:type="pct" w:w="4236"/>
+        <w:tblLayout w:type="fixed"/>
+        <w:tblLook w:firstRow="1" w:lastRow="0" w:firstColumn="0" w:lastColumn="0" w:noHBand="0" w:noVBand="0" w:val="0020"/>
+        <w:tblCaption w:val="Vendor B Memory Compiler 定义"/>
+      </w:tblPr>
+      <w:tblGrid>
+        <w:gridCol w:w="1100"/>
+        <w:gridCol w:w="3630"/>
+        <w:gridCol w:w="1980"/>
+      </w:tblGrid>
+      <w:tr>
+        <w:trPr>
+          <w:tblHeader w:val="on"/>
+        </w:trPr>
+        <w:tc>
+          <w:tcPr/>
+          <w:p>
+            <w:pPr>
+              <w:pStyle w:val="Compact"/>
+            </w:pPr>
+            <w:r>
+              <w:t xml:space="preserve">Index</w:t>
+            </w:r>
+          </w:p>
+        </w:tc>
+        <w:tc>
+          <w:tcPr/>
+          <w:p>
+            <w:pPr>
+              <w:pStyle w:val="Compact"/>
+            </w:pPr>
+            <w:r>
+              <w:t xml:space="preserve">Memory Compiler</w:t>
+            </w:r>
+          </w:p>
+        </w:tc>
+        <w:tc>
+          <w:tcPr/>
+          <w:p>
+            <w:pPr>
+              <w:pStyle w:val="Compact"/>
+            </w:pPr>
+            <w:r>
+              <w:t xml:space="preserve">Bitcell Type</w:t>
+            </w:r>
+          </w:p>
+        </w:tc>
+      </w:tr>
+      <w:tr>
+        <w:tc>
+          <w:tcPr/>
+          <w:p>
+            <w:pPr>
+              <w:pStyle w:val="Compact"/>
+            </w:pPr>
+            <w:r>
+              <w:t xml:space="preserve">P1</w:t>
+            </w:r>
+          </w:p>
+        </w:tc>
+        <w:tc>
+          <w:tcPr/>
+          <w:p>
+            <w:pPr>
+              <w:pStyle w:val="Compact"/>
+            </w:pPr>
+            <w:r>
+              <w:t xml:space="preserve">One Port Register File</w:t>
+            </w:r>
+          </w:p>
+        </w:tc>
+        <w:tc>
+          <w:tcPr/>
+          <w:p>
+            <w:pPr>
+              <w:pStyle w:val="Compact"/>
+            </w:pPr>
+            <w:r>
+              <w:t xml:space="preserve">D0907 HC6T</w:t>
+            </w:r>
+          </w:p>
+        </w:tc>
+      </w:tr>
+      <w:tr>
+        <w:tc>
+          <w:tcPr/>
+          <w:p>
+            <w:pPr>
+              <w:pStyle w:val="Compact"/>
+            </w:pPr>
+            <w:r>
+              <w:t xml:space="preserve">P2</w:t>
+            </w:r>
+          </w:p>
+        </w:tc>
+        <w:tc>
+          <w:tcPr/>
+          <w:p>
+            <w:pPr>
+              <w:pStyle w:val="Compact"/>
+            </w:pPr>
+            <w:r>
+              <w:t xml:space="preserve">Two Port Register File</w:t>
+            </w:r>
+          </w:p>
+        </w:tc>
+        <w:tc>
+          <w:tcPr/>
+          <w:p>
+            <w:pPr>
+              <w:pStyle w:val="Compact"/>
+            </w:pPr>
+            <w:r>
+              <w:t xml:space="preserve">D1300 8T2P_2FIN</w:t>
+            </w:r>
+          </w:p>
+        </w:tc>
+      </w:tr>
+      <w:tr>
+        <w:tc>
+          <w:tcPr/>
+          <w:p>
+            <w:pPr>
+              <w:pStyle w:val="Compact"/>
+            </w:pPr>
+            <w:r>
+              <w:t xml:space="preserve">P3</w:t>
+            </w:r>
+          </w:p>
+        </w:tc>
+        <w:tc>
+          <w:tcPr/>
+          <w:p>
+            <w:pPr>
+              <w:pStyle w:val="Compact"/>
+            </w:pPr>
+            <w:r>
+              <w:t xml:space="preserve">Dual Port SRAM Compiler</w:t>
+            </w:r>
+          </w:p>
+        </w:tc>
+        <w:tc>
+          <w:tcPr/>
+          <w:p>
+            <w:pPr>
+              <w:pStyle w:val="Compact"/>
+            </w:pPr>
+            <w:r>
+              <w:t xml:space="preserve">D1940 HCDP</w:t>
+            </w:r>
+          </w:p>
+        </w:tc>
+      </w:tr>
+      <w:tr>
+        <w:tc>
+          <w:tcPr/>
+          <w:p>
+            <w:pPr>
+              <w:pStyle w:val="Compact"/>
+            </w:pPr>
+            <w:r>
+              <w:t xml:space="preserve">P4</w:t>
+            </w:r>
+          </w:p>
+        </w:tc>
+        <w:tc>
+          <w:tcPr/>
+          <w:p>
+            <w:pPr>
+              <w:pStyle w:val="Compact"/>
+            </w:pPr>
+            <w:r>
+              <w:t xml:space="preserve">ROM Compiler</w:t>
+            </w:r>
+          </w:p>
+        </w:tc>
+        <w:tc>
+          <w:tcPr/>
+          <w:p>
+            <w:pPr>
+              <w:pStyle w:val="Compact"/>
+            </w:pPr>
+            <w:r>
+              <w:t xml:space="preserve">–</w:t>
+            </w:r>
+          </w:p>
+        </w:tc>
+      </w:tr>
+      <w:tr>
+        <w:tc>
+          <w:tcPr/>
+          <w:p>
+            <w:pPr>
+              <w:pStyle w:val="Compact"/>
+            </w:pPr>
+            <w:r>
+              <w:t xml:space="preserve">P5</w:t>
+            </w:r>
+          </w:p>
+        </w:tc>
+        <w:tc>
+          <w:tcPr/>
+          <w:p>
+            <w:pPr>
+              <w:pStyle w:val="Compact"/>
+            </w:pPr>
+            <w:r>
+              <w:t xml:space="preserve">Ultra High Density Single Port</w:t>
+            </w:r>
+            <w:r>
+              <w:t xml:space="preserve"> </w:t>
+            </w:r>
+            <w:r>
+              <w:t xml:space="preserve">SRAM Compiler</w:t>
+            </w:r>
+          </w:p>
+        </w:tc>
+        <w:tc>
+          <w:tcPr/>
+          <w:p>
+            <w:pPr>
+              <w:pStyle w:val="Compact"/>
+            </w:pPr>
+            <w:r>
+              <w:t xml:space="preserve">D0907 HC6T</w:t>
+            </w:r>
+          </w:p>
+        </w:tc>
+      </w:tr>
+      <w:tr>
+        <w:tc>
+          <w:tcPr/>
+          <w:p>
+            <w:pPr>
+              <w:pStyle w:val="Compact"/>
+            </w:pPr>
+            <w:r>
+              <w:t xml:space="preserve">P6</w:t>
+            </w:r>
+          </w:p>
+        </w:tc>
+        <w:tc>
+          <w:tcPr/>
+          <w:p>
+            <w:pPr>
+              <w:pStyle w:val="Compact"/>
+            </w:pPr>
+            <w:r>
+              <w:t xml:space="preserve">Ultra High Density Two Port</w:t>
+            </w:r>
+            <w:r>
+              <w:t xml:space="preserve"> </w:t>
+            </w:r>
+            <w:r>
+              <w:t xml:space="preserve">SRAM Compiler</w:t>
+            </w:r>
+          </w:p>
+        </w:tc>
+        <w:tc>
+          <w:tcPr/>
+          <w:p>
+            <w:pPr>
+              <w:pStyle w:val="Compact"/>
+            </w:pPr>
+            <w:r>
+              <w:t xml:space="preserve">D0907 HC6T</w:t>
+            </w:r>
+          </w:p>
+        </w:tc>
+      </w:tr>
+      <w:tr>
+        <w:tc>
+          <w:tcPr/>
+          <w:p>
+            <w:pPr>
+              <w:pStyle w:val="Compact"/>
+            </w:pPr>
+            <w:r>
+              <w:t xml:space="preserve">P7</w:t>
+            </w:r>
+          </w:p>
+        </w:tc>
+        <w:tc>
+          <w:tcPr/>
+          <w:p>
+            <w:pPr>
+              <w:pStyle w:val="Compact"/>
+            </w:pPr>
+            <w:r>
+              <w:t xml:space="preserve">Single Port SRAM Compiler</w:t>
+            </w:r>
+          </w:p>
+        </w:tc>
+        <w:tc>
+          <w:tcPr/>
+          <w:p>
+            <w:pPr>
+              <w:pStyle w:val="Compact"/>
+            </w:pPr>
+            <w:r>
+              <w:t xml:space="preserve">D0907 HC6T</w:t>
+            </w:r>
+          </w:p>
+        </w:tc>
+      </w:tr>
+      <w:tr>
+        <w:tc>
+          <w:tcPr/>
+          <w:p>
+            <w:pPr>
+              <w:pStyle w:val="Compact"/>
+            </w:pPr>
+            <w:r>
+              <w:t xml:space="preserve">P8</w:t>
+            </w:r>
+          </w:p>
+        </w:tc>
+        <w:tc>
+          <w:tcPr/>
+          <w:p>
+            <w:pPr>
+              <w:pStyle w:val="Compact"/>
+            </w:pPr>
+            <w:r>
+              <w:t xml:space="preserve">High Density Single Port</w:t>
+            </w:r>
+            <w:r>
+              <w:t xml:space="preserve"> </w:t>
+            </w:r>
+            <w:r>
+              <w:t xml:space="preserve">Single Bank SRAM Compiler with</w:t>
+            </w:r>
+            <w:r>
+              <w:t xml:space="preserve"> </w:t>
+            </w:r>
+            <w:r>
+              <w:t xml:space="preserve">HD cell</w:t>
+            </w:r>
+          </w:p>
+        </w:tc>
+        <w:tc>
+          <w:tcPr/>
+          <w:p>
+            <w:pPr>
+              <w:pStyle w:val="Compact"/>
+            </w:pPr>
+            <w:r>
+              <w:t xml:space="preserve">D0734 HD6T</w:t>
+            </w:r>
+          </w:p>
+        </w:tc>
+      </w:tr>
+      <w:tr>
+        <w:tc>
+          <w:tcPr/>
+          <w:p>
+            <w:pPr>
+              <w:pStyle w:val="Compact"/>
+            </w:pPr>
+            <w:r>
+              <w:t xml:space="preserve">P9</w:t>
+            </w:r>
+          </w:p>
+        </w:tc>
+        <w:tc>
+          <w:tcPr/>
+          <w:p>
+            <w:pPr>
+              <w:pStyle w:val="Compact"/>
+            </w:pPr>
+            <w:r>
+              <w:t xml:space="preserve">High Density Single Port Multi</w:t>
+            </w:r>
+            <w:r>
+              <w:t xml:space="preserve"> </w:t>
+            </w:r>
+            <w:r>
+              <w:t xml:space="preserve">Bank SRAM Compiler with HD</w:t>
+            </w:r>
+            <w:r>
+              <w:t xml:space="preserve"> </w:t>
+            </w:r>
+            <w:r>
+              <w:t xml:space="preserve">cell</w:t>
+            </w:r>
+          </w:p>
+        </w:tc>
+        <w:tc>
+          <w:tcPr/>
+          <w:p>
+            <w:pPr>
+              <w:pStyle w:val="Compact"/>
+            </w:pPr>
+            <w:r>
+              <w:t xml:space="preserve">D0734 HD6T</w:t>
+            </w:r>
+          </w:p>
+        </w:tc>
+      </w:tr>
+      <w:tr>
+        <w:tc>
+          <w:tcPr/>
+          <w:p>
+            <w:pPr>
+              <w:pStyle w:val="Compact"/>
+            </w:pPr>
+            <w:r>
+              <w:t xml:space="preserve">P10</w:t>
+            </w:r>
+          </w:p>
+        </w:tc>
+        <w:tc>
+          <w:tcPr/>
+          <w:p>
+            <w:pPr>
+              <w:pStyle w:val="Compact"/>
+            </w:pPr>
+            <w:r>
+              <w:t xml:space="preserve">High Density Single Port</w:t>
+            </w:r>
+            <w:r>
+              <w:t xml:space="preserve"> </w:t>
+            </w:r>
+            <w:r>
+              <w:t xml:space="preserve">Single Bank SRAM Compiler with</w:t>
+            </w:r>
+            <w:r>
+              <w:t xml:space="preserve"> </w:t>
+            </w:r>
+            <w:r>
+              <w:t xml:space="preserve">Smaller HD cell</w:t>
+            </w:r>
+          </w:p>
+        </w:tc>
+        <w:tc>
+          <w:tcPr/>
+          <w:p>
+            <w:pPr>
+              <w:pStyle w:val="Compact"/>
+            </w:pPr>
+            <w:r>
+              <w:t xml:space="preserve">D0690 SHD6T</w:t>
+            </w:r>
+          </w:p>
+        </w:tc>
+      </w:tr>
+      <w:tr>
+        <w:tc>
+          <w:tcPr/>
+          <w:p>
+            <w:pPr>
+              <w:pStyle w:val="Compact"/>
+            </w:pPr>
+            <w:r>
+              <w:t xml:space="preserve">P11</w:t>
+            </w:r>
+          </w:p>
+        </w:tc>
+        <w:tc>
+          <w:tcPr/>
+          <w:p>
+            <w:pPr>
+              <w:pStyle w:val="Compact"/>
+            </w:pPr>
+            <w:r>
+              <w:t xml:space="preserve">High Density Single Port Multi</w:t>
+            </w:r>
+            <w:r>
+              <w:t xml:space="preserve"> </w:t>
+            </w:r>
+            <w:r>
+              <w:t xml:space="preserve">Bank SRAM Compiler with</w:t>
+            </w:r>
+            <w:r>
+              <w:t xml:space="preserve"> </w:t>
+            </w:r>
+            <w:r>
+              <w:t xml:space="preserve">Smaller HD cell</w:t>
+            </w:r>
+          </w:p>
+        </w:tc>
+        <w:tc>
+          <w:tcPr/>
+          <w:p>
+            <w:pPr>
+              <w:pStyle w:val="Compact"/>
+            </w:pPr>
+            <w:r>
+              <w:t xml:space="preserve">D0690 SHD6T</w:t>
+            </w:r>
+          </w:p>
+        </w:tc>
+      </w:tr>
+      <w:tr>
+        <w:tc>
+          <w:tcPr/>
+          <w:p>
+            <w:pPr>
+              <w:pStyle w:val="Compact"/>
+            </w:pPr>
+            <w:r>
+              <w:t xml:space="preserve">P12</w:t>
+            </w:r>
+          </w:p>
+        </w:tc>
+        <w:tc>
+          <w:tcPr/>
+          <w:p>
+            <w:pPr>
+              <w:pStyle w:val="Compact"/>
+            </w:pPr>
+            <w:r>
+              <w:t xml:space="preserve">High Performace Single Port</w:t>
+            </w:r>
+            <w:r>
+              <w:t xml:space="preserve"> </w:t>
+            </w:r>
+            <w:r>
+              <w:t xml:space="preserve">Single Bank SRAM Compiler with</w:t>
+            </w:r>
+            <w:r>
+              <w:t xml:space="preserve"> </w:t>
+            </w:r>
+            <w:r>
+              <w:t xml:space="preserve">Smaller HC cell</w:t>
+            </w:r>
+          </w:p>
+        </w:tc>
+        <w:tc>
+          <w:tcPr/>
+          <w:p>
+            <w:pPr>
+              <w:pStyle w:val="Compact"/>
+            </w:pPr>
+            <w:r>
+              <w:t xml:space="preserve">D0864 SHC6T</w:t>
+            </w:r>
+          </w:p>
+        </w:tc>
+      </w:tr>
+      <w:tr>
+        <w:tc>
+          <w:tcPr/>
+          <w:p>
+            <w:pPr>
+              <w:pStyle w:val="Compact"/>
+            </w:pPr>
+            <w:r>
+              <w:t xml:space="preserve">P13</w:t>
+            </w:r>
+          </w:p>
+        </w:tc>
+        <w:tc>
+          <w:tcPr/>
+          <w:p>
+            <w:pPr>
+              <w:pStyle w:val="Compact"/>
+            </w:pPr>
+            <w:r>
+              <w:t xml:space="preserve">High Performace Single Port</w:t>
+            </w:r>
+            <w:r>
+              <w:t xml:space="preserve"> </w:t>
+            </w:r>
+            <w:r>
+              <w:t xml:space="preserve">Multi Bank SRAM Compiler with</w:t>
+            </w:r>
+            <w:r>
+              <w:t xml:space="preserve"> </w:t>
+            </w:r>
+            <w:r>
+              <w:t xml:space="preserve">Smaller HC cell</w:t>
+            </w:r>
+          </w:p>
+        </w:tc>
+        <w:tc>
+          <w:tcPr/>
+          <w:p>
+            <w:pPr>
+              <w:pStyle w:val="Compact"/>
+            </w:pPr>
+            <w:r>
+              <w:t xml:space="preserve">D0864 SHC6T</w:t>
+            </w:r>
+          </w:p>
+        </w:tc>
+      </w:tr>
+      <w:tr>
+        <w:tc>
+          <w:tcPr/>
+          <w:p>
+            <w:pPr>
+              <w:pStyle w:val="Compact"/>
+            </w:pPr>
+            <w:r>
+              <w:t xml:space="preserve">P14</w:t>
+            </w:r>
+          </w:p>
+        </w:tc>
+        <w:tc>
+          <w:tcPr/>
+          <w:p>
+            <w:pPr>
+              <w:pStyle w:val="Compact"/>
+            </w:pPr>
+            <w:r>
+              <w:t xml:space="preserve">High Performace L1 Cache with</w:t>
+            </w:r>
+            <w:r>
+              <w:t xml:space="preserve"> </w:t>
+            </w:r>
+            <w:r>
+              <w:t xml:space="preserve">HC cell</w:t>
+            </w:r>
+          </w:p>
+        </w:tc>
+        <w:tc>
+          <w:tcPr/>
+          <w:p>
+            <w:pPr>
+              <w:pStyle w:val="Compact"/>
+            </w:pPr>
+            <w:r>
+              <w:t xml:space="preserve">D0907 HC6T</w:t>
             </w:r>
           </w:p>
         </w:tc>

</xml_diff>